<commit_message>
Record the clean-environment reproduction check in the docs and report
A clean extraction of the delivery ZIP, installed into a new virtual
environment and run end to end on the study's Binance files, reproduced
all 670 numeric values in results.json, the frozen selection and all 63
pipeline tables exactly. Committed results are unchanged.

Co-Authored-By: Claude Opus 5.5 <noreply@anthropic.com>
Claude-Session: https://claude.ai/code/session_01UrzjVLoex8hA7VrcAJBPXh
</commit_message>
<xml_diff>
--- a/reports/Final_Gravia_Project_Report.docx
+++ b/reports/Final_Gravia_Project_Report.docx
@@ -9823,7 +9823,37 @@
         <w:rPr>
           <w:rFonts w:ascii="Arial" w:cs="Arial" w:eastAsia="Arial" w:hAnsi="Arial"/>
         </w:rPr>
-        <w:t xml:space="preserve">) exercises every stage on generated data in a temporary folder without touching any result.</w:t>
+        <w:t xml:space="preserve">) exercises every stage on generated data in a temporary folder without touching any result. As a final check, the delivery package was extracted into an empty folder, installed into a new virtual environment from </w:t>
+      </w:r>
+      <w:r>
+        <w:rPr>
+          <w:rFonts w:ascii="Courier New" w:cs="Courier New" w:eastAsia="Courier New" w:hAnsi="Courier New"/>
+          <w:color w:val="8B1A1A"/>
+          <w:sz w:val="18"/>
+          <w:szCs w:val="18"/>
+        </w:rPr>
+        <w:t xml:space="preserve">requirements.txt</w:t>
+      </w:r>
+      <w:r>
+        <w:rPr>
+          <w:rFonts w:ascii="Arial" w:cs="Arial" w:eastAsia="Arial" w:hAnsi="Arial"/>
+        </w:rPr>
+        <w:t xml:space="preserve">, and run end to end on the same Binance files: all 670 numeric values in </w:t>
+      </w:r>
+      <w:r>
+        <w:rPr>
+          <w:rFonts w:ascii="Courier New" w:cs="Courier New" w:eastAsia="Courier New" w:hAnsi="Courier New"/>
+          <w:color w:val="8B1A1A"/>
+          <w:sz w:val="18"/>
+          <w:szCs w:val="18"/>
+        </w:rPr>
+        <w:t xml:space="preserve">results.json</w:t>
+      </w:r>
+      <w:r>
+        <w:rPr>
+          <w:rFonts w:ascii="Arial" w:cs="Arial" w:eastAsia="Arial" w:hAnsi="Arial"/>
+        </w:rPr>
+        <w:t xml:space="preserve">, the frozen selection and all 63 pipeline tables were reproduced exactly, and the experiment log matched row for row apart from its timestamps.</w:t>
       </w:r>
     </w:p>
     <w:tbl>

</xml_diff>